<commit_message>
Update Assignment 1 summary document
</commit_message>
<xml_diff>
--- a/Assignment_1/Celebal_Assignment_1.docx
+++ b/Assignment_1/Celebal_Assignment_1.docx
@@ -28,20 +28,232 @@
     </w:p>
     <w:p>
       <w:pPr>
-        <w:jc w:val="right"/>
-        <w:rPr>
-          <w:rFonts w:ascii="Times New Roman" w:hAnsi="Times New Roman" w:cs="Times New Roman"/>
-          <w:sz w:val="32"/>
-          <w:szCs w:val="32"/>
-        </w:rPr>
-      </w:pPr>
-      <w:r>
-        <w:rPr>
-          <w:rFonts w:ascii="Times New Roman" w:hAnsi="Times New Roman" w:cs="Times New Roman"/>
-          <w:sz w:val="32"/>
-          <w:szCs w:val="32"/>
+        <w:spacing w:after="10" w:line="240" w:lineRule="auto"/>
+        <w:rPr>
+          <w:rFonts w:ascii="Times New Roman" w:hAnsi="Times New Roman" w:cs="Times New Roman"/>
+          <w:sz w:val="28"/>
+          <w:szCs w:val="28"/>
+        </w:rPr>
+      </w:pPr>
+      <w:r>
+        <w:rPr>
+          <w:rFonts w:ascii="Times New Roman" w:hAnsi="Times New Roman" w:cs="Times New Roman"/>
+          <w:b/>
+          <w:bCs/>
+          <w:sz w:val="28"/>
+          <w:szCs w:val="28"/>
+        </w:rPr>
+        <w:t>Name:</w:t>
+      </w:r>
+      <w:r>
+        <w:rPr>
+          <w:rFonts w:ascii="Times New Roman" w:hAnsi="Times New Roman" w:cs="Times New Roman"/>
+          <w:sz w:val="28"/>
+          <w:szCs w:val="28"/>
+        </w:rPr>
+        <w:t xml:space="preserve"> </w:t>
+      </w:r>
+      <w:r>
+        <w:rPr>
+          <w:rFonts w:ascii="Times New Roman" w:hAnsi="Times New Roman" w:cs="Times New Roman"/>
+          <w:sz w:val="28"/>
+          <w:szCs w:val="28"/>
         </w:rPr>
         <w:t>K Syna Reddy</w:t>
+      </w:r>
+    </w:p>
+    <w:p>
+      <w:pPr>
+        <w:spacing w:after="10" w:line="240" w:lineRule="auto"/>
+        <w:rPr>
+          <w:rFonts w:ascii="Times New Roman" w:hAnsi="Times New Roman" w:cs="Times New Roman"/>
+          <w:sz w:val="28"/>
+          <w:szCs w:val="28"/>
+        </w:rPr>
+      </w:pPr>
+      <w:r>
+        <w:rPr>
+          <w:rFonts w:ascii="Times New Roman" w:hAnsi="Times New Roman" w:cs="Times New Roman"/>
+          <w:b/>
+          <w:bCs/>
+          <w:sz w:val="28"/>
+          <w:szCs w:val="28"/>
+        </w:rPr>
+        <w:t>Student ID:</w:t>
+      </w:r>
+      <w:r>
+        <w:rPr>
+          <w:rFonts w:ascii="Times New Roman" w:hAnsi="Times New Roman" w:cs="Times New Roman"/>
+          <w:sz w:val="28"/>
+          <w:szCs w:val="28"/>
+        </w:rPr>
+        <w:t xml:space="preserve"> </w:t>
+      </w:r>
+      <w:r>
+        <w:rPr>
+          <w:rFonts w:ascii="Times New Roman" w:hAnsi="Times New Roman" w:cs="Times New Roman"/>
+          <w:sz w:val="28"/>
+          <w:szCs w:val="28"/>
+        </w:rPr>
+        <w:t>CT_CSI_DE_638</w:t>
+      </w:r>
+    </w:p>
+    <w:p>
+      <w:pPr>
+        <w:spacing w:after="10" w:line="240" w:lineRule="auto"/>
+        <w:rPr>
+          <w:rFonts w:ascii="Times New Roman" w:hAnsi="Times New Roman" w:cs="Times New Roman"/>
+          <w:sz w:val="28"/>
+          <w:szCs w:val="28"/>
+        </w:rPr>
+      </w:pPr>
+      <w:r>
+        <w:rPr>
+          <w:rFonts w:ascii="Times New Roman" w:hAnsi="Times New Roman" w:cs="Times New Roman"/>
+          <w:b/>
+          <w:bCs/>
+          <w:sz w:val="28"/>
+          <w:szCs w:val="28"/>
+        </w:rPr>
+        <w:t>College:</w:t>
+      </w:r>
+      <w:r>
+        <w:rPr>
+          <w:rFonts w:ascii="Times New Roman" w:hAnsi="Times New Roman" w:cs="Times New Roman"/>
+          <w:sz w:val="28"/>
+          <w:szCs w:val="28"/>
+        </w:rPr>
+        <w:t xml:space="preserve"> CVR College of Engineering</w:t>
+      </w:r>
+    </w:p>
+    <w:p>
+      <w:pPr>
+        <w:spacing w:after="10" w:line="240" w:lineRule="auto"/>
+        <w:rPr>
+          <w:rFonts w:ascii="Times New Roman" w:hAnsi="Times New Roman" w:cs="Times New Roman"/>
+          <w:sz w:val="28"/>
+          <w:szCs w:val="28"/>
+        </w:rPr>
+      </w:pPr>
+      <w:r>
+        <w:rPr>
+          <w:rFonts w:ascii="Times New Roman" w:hAnsi="Times New Roman" w:cs="Times New Roman"/>
+          <w:b/>
+          <w:bCs/>
+          <w:sz w:val="28"/>
+          <w:szCs w:val="28"/>
+        </w:rPr>
+        <w:t>Roll No:</w:t>
+      </w:r>
+      <w:r>
+        <w:rPr>
+          <w:rFonts w:ascii="Times New Roman" w:hAnsi="Times New Roman" w:cs="Times New Roman"/>
+          <w:sz w:val="28"/>
+          <w:szCs w:val="28"/>
+        </w:rPr>
+        <w:t xml:space="preserve"> 23B81A67J0</w:t>
+      </w:r>
+    </w:p>
+    <w:p>
+      <w:pPr>
+        <w:spacing w:after="10" w:line="240" w:lineRule="auto"/>
+        <w:rPr>
+          <w:rFonts w:ascii="Times New Roman" w:hAnsi="Times New Roman" w:cs="Times New Roman"/>
+          <w:sz w:val="28"/>
+          <w:szCs w:val="28"/>
+        </w:rPr>
+      </w:pPr>
+      <w:r>
+        <w:rPr>
+          <w:rFonts w:ascii="Times New Roman" w:hAnsi="Times New Roman" w:cs="Times New Roman"/>
+          <w:b/>
+          <w:bCs/>
+          <w:sz w:val="28"/>
+          <w:szCs w:val="28"/>
+        </w:rPr>
+        <w:t>Department:</w:t>
+      </w:r>
+      <w:r>
+        <w:rPr>
+          <w:rFonts w:ascii="Times New Roman" w:hAnsi="Times New Roman" w:cs="Times New Roman"/>
+          <w:sz w:val="28"/>
+          <w:szCs w:val="28"/>
+        </w:rPr>
+        <w:t xml:space="preserve"> </w:t>
+      </w:r>
+      <w:proofErr w:type="gramStart"/>
+      <w:r>
+        <w:rPr>
+          <w:rFonts w:ascii="Times New Roman" w:hAnsi="Times New Roman" w:cs="Times New Roman"/>
+          <w:sz w:val="28"/>
+          <w:szCs w:val="28"/>
+        </w:rPr>
+        <w:t>B.Tech</w:t>
+      </w:r>
+      <w:proofErr w:type="gramEnd"/>
+      <w:r>
+        <w:rPr>
+          <w:rFonts w:ascii="Times New Roman" w:hAnsi="Times New Roman" w:cs="Times New Roman"/>
+          <w:sz w:val="28"/>
+          <w:szCs w:val="28"/>
+        </w:rPr>
+        <w:t xml:space="preserve"> CSE (Data Science) </w:t>
+      </w:r>
+    </w:p>
+    <w:p>
+      <w:pPr>
+        <w:spacing w:after="10" w:line="240" w:lineRule="auto"/>
+        <w:rPr>
+          <w:rFonts w:ascii="Times New Roman" w:hAnsi="Times New Roman" w:cs="Times New Roman"/>
+          <w:sz w:val="28"/>
+          <w:szCs w:val="28"/>
+        </w:rPr>
+      </w:pPr>
+      <w:r>
+        <w:rPr>
+          <w:rFonts w:ascii="Times New Roman" w:hAnsi="Times New Roman" w:cs="Times New Roman"/>
+          <w:b/>
+          <w:bCs/>
+          <w:sz w:val="28"/>
+          <w:szCs w:val="28"/>
+        </w:rPr>
+        <w:t>Internship:</w:t>
+      </w:r>
+      <w:r>
+        <w:rPr>
+          <w:rFonts w:ascii="Times New Roman" w:hAnsi="Times New Roman" w:cs="Times New Roman"/>
+          <w:sz w:val="28"/>
+          <w:szCs w:val="28"/>
+        </w:rPr>
+        <w:t xml:space="preserve"> Celebal Technologies - Data Engineering </w:t>
+      </w:r>
+    </w:p>
+    <w:p>
+      <w:pPr>
+        <w:spacing w:after="10" w:line="240" w:lineRule="auto"/>
+        <w:rPr>
+          <w:rFonts w:ascii="Times New Roman" w:hAnsi="Times New Roman" w:cs="Times New Roman"/>
+          <w:sz w:val="28"/>
+          <w:szCs w:val="28"/>
+        </w:rPr>
+      </w:pPr>
+      <w:r>
+        <w:rPr>
+          <w:rFonts w:ascii="Times New Roman" w:hAnsi="Times New Roman" w:cs="Times New Roman"/>
+          <w:b/>
+          <w:bCs/>
+          <w:sz w:val="28"/>
+          <w:szCs w:val="28"/>
+        </w:rPr>
+        <w:t>Date:</w:t>
+      </w:r>
+      <w:r>
+        <w:rPr>
+          <w:rFonts w:ascii="Times New Roman" w:hAnsi="Times New Roman" w:cs="Times New Roman"/>
+          <w:sz w:val="28"/>
+          <w:szCs w:val="28"/>
+        </w:rPr>
+        <w:t xml:space="preserve"> 31 May 2026</w:t>
       </w:r>
     </w:p>
     <w:p>
@@ -56,17 +268,43 @@
           <w:u w:val="single"/>
         </w:rPr>
       </w:pPr>
-      <w:r>
-        <w:rPr>
-          <w:rFonts w:ascii="Times New Roman" w:hAnsi="Times New Roman" w:cs="Times New Roman"/>
-          <w:b/>
-          <w:bCs/>
-          <w:sz w:val="32"/>
-          <w:szCs w:val="32"/>
+    </w:p>
+    <w:p>
+      <w:pPr>
+        <w:jc w:val="center"/>
+        <w:rPr>
+          <w:rFonts w:ascii="Times New Roman" w:hAnsi="Times New Roman" w:cs="Times New Roman"/>
+          <w:b/>
+          <w:bCs/>
+          <w:sz w:val="40"/>
+          <w:szCs w:val="40"/>
           <w:u w:val="single"/>
         </w:rPr>
+      </w:pPr>
+      <w:r>
+        <w:rPr>
+          <w:rFonts w:ascii="Times New Roman" w:hAnsi="Times New Roman" w:cs="Times New Roman"/>
+          <w:b/>
+          <w:bCs/>
+          <w:sz w:val="40"/>
+          <w:szCs w:val="40"/>
+          <w:u w:val="single"/>
+        </w:rPr>
         <w:t>Summary</w:t>
       </w:r>
+    </w:p>
+    <w:p>
+      <w:pPr>
+        <w:jc w:val="both"/>
+        <w:rPr>
+          <w:rFonts w:ascii="Times New Roman" w:hAnsi="Times New Roman" w:cs="Times New Roman"/>
+          <w:b/>
+          <w:bCs/>
+          <w:sz w:val="28"/>
+          <w:szCs w:val="28"/>
+          <w:u w:val="single"/>
+        </w:rPr>
+      </w:pPr>
     </w:p>
     <w:p>
       <w:pPr>
@@ -243,6 +481,19 @@
           <w:u w:val="single"/>
         </w:rPr>
       </w:pPr>
+    </w:p>
+    <w:p>
+      <w:pPr>
+        <w:jc w:val="both"/>
+        <w:rPr>
+          <w:rFonts w:ascii="Times New Roman" w:hAnsi="Times New Roman" w:cs="Times New Roman"/>
+          <w:b/>
+          <w:bCs/>
+          <w:sz w:val="28"/>
+          <w:szCs w:val="28"/>
+          <w:u w:val="single"/>
+        </w:rPr>
+      </w:pPr>
       <w:r>
         <w:rPr>
           <w:rFonts w:ascii="Times New Roman" w:hAnsi="Times New Roman" w:cs="Times New Roman"/>
@@ -500,13 +751,86 @@
           <w:u w:val="single"/>
         </w:rPr>
       </w:pPr>
-      <w:r>
+    </w:p>
+    <w:p>
+      <w:pPr>
+        <w:spacing w:before="80" w:after="100"/>
+        <w:jc w:val="both"/>
         <w:rPr>
           <w:rFonts w:ascii="Times New Roman" w:hAnsi="Times New Roman" w:cs="Times New Roman"/>
           <w:b/>
           <w:bCs/>
           <w:u w:val="single"/>
         </w:rPr>
+      </w:pPr>
+    </w:p>
+    <w:p>
+      <w:pPr>
+        <w:spacing w:before="80" w:after="100"/>
+        <w:jc w:val="both"/>
+        <w:rPr>
+          <w:rFonts w:ascii="Times New Roman" w:hAnsi="Times New Roman" w:cs="Times New Roman"/>
+          <w:b/>
+          <w:bCs/>
+          <w:u w:val="single"/>
+        </w:rPr>
+      </w:pPr>
+    </w:p>
+    <w:p>
+      <w:pPr>
+        <w:spacing w:before="80" w:after="100"/>
+        <w:jc w:val="both"/>
+        <w:rPr>
+          <w:rFonts w:ascii="Times New Roman" w:hAnsi="Times New Roman" w:cs="Times New Roman"/>
+          <w:b/>
+          <w:bCs/>
+          <w:u w:val="single"/>
+        </w:rPr>
+      </w:pPr>
+    </w:p>
+    <w:p>
+      <w:pPr>
+        <w:spacing w:before="80" w:after="100"/>
+        <w:jc w:val="both"/>
+        <w:rPr>
+          <w:rFonts w:ascii="Times New Roman" w:hAnsi="Times New Roman" w:cs="Times New Roman"/>
+          <w:b/>
+          <w:bCs/>
+          <w:u w:val="single"/>
+        </w:rPr>
+      </w:pPr>
+    </w:p>
+    <w:p>
+      <w:pPr>
+        <w:spacing w:before="80" w:after="100"/>
+        <w:jc w:val="both"/>
+        <w:rPr>
+          <w:rFonts w:ascii="Times New Roman" w:hAnsi="Times New Roman" w:cs="Times New Roman"/>
+          <w:b/>
+          <w:bCs/>
+          <w:u w:val="single"/>
+        </w:rPr>
+      </w:pPr>
+    </w:p>
+    <w:p>
+      <w:pPr>
+        <w:spacing w:before="80" w:after="100"/>
+        <w:jc w:val="both"/>
+        <w:rPr>
+          <w:rFonts w:ascii="Times New Roman" w:hAnsi="Times New Roman" w:cs="Times New Roman"/>
+          <w:b/>
+          <w:bCs/>
+          <w:u w:val="single"/>
+        </w:rPr>
+      </w:pPr>
+      <w:r>
+        <w:rPr>
+          <w:rFonts w:ascii="Times New Roman" w:hAnsi="Times New Roman" w:cs="Times New Roman"/>
+          <w:b/>
+          <w:bCs/>
+          <w:u w:val="single"/>
+        </w:rPr>
+        <w:lastRenderedPageBreak/>
         <w:t xml:space="preserve">2b. </w:t>
       </w:r>
       <w:proofErr w:type="gramStart"/>
@@ -729,50 +1053,13 @@
           <w:u w:val="single"/>
         </w:rPr>
       </w:pPr>
-    </w:p>
-    <w:p>
-      <w:pPr>
-        <w:spacing w:before="80" w:after="100"/>
-        <w:jc w:val="both"/>
+      <w:r>
         <w:rPr>
           <w:rFonts w:ascii="Times New Roman" w:hAnsi="Times New Roman" w:cs="Times New Roman"/>
           <w:b/>
           <w:bCs/>
           <w:u w:val="single"/>
         </w:rPr>
-      </w:pPr>
-    </w:p>
-    <w:p>
-      <w:pPr>
-        <w:spacing w:before="80" w:after="100"/>
-        <w:jc w:val="both"/>
-        <w:rPr>
-          <w:rFonts w:ascii="Times New Roman" w:hAnsi="Times New Roman" w:cs="Times New Roman"/>
-          <w:b/>
-          <w:bCs/>
-          <w:u w:val="single"/>
-        </w:rPr>
-      </w:pPr>
-    </w:p>
-    <w:p>
-      <w:pPr>
-        <w:spacing w:before="80" w:after="100"/>
-        <w:jc w:val="both"/>
-        <w:rPr>
-          <w:rFonts w:ascii="Times New Roman" w:hAnsi="Times New Roman" w:cs="Times New Roman"/>
-          <w:b/>
-          <w:bCs/>
-          <w:u w:val="single"/>
-        </w:rPr>
-      </w:pPr>
-      <w:r>
-        <w:rPr>
-          <w:rFonts w:ascii="Times New Roman" w:hAnsi="Times New Roman" w:cs="Times New Roman"/>
-          <w:b/>
-          <w:bCs/>
-          <w:u w:val="single"/>
-        </w:rPr>
-        <w:lastRenderedPageBreak/>
         <w:t xml:space="preserve">2c. </w:t>
       </w:r>
       <w:proofErr w:type="gramStart"/>
@@ -1457,66 +1744,6 @@
           <w:u w:val="single"/>
         </w:rPr>
       </w:pPr>
-    </w:p>
-    <w:p>
-      <w:pPr>
-        <w:spacing w:before="80" w:after="100"/>
-        <w:jc w:val="both"/>
-        <w:rPr>
-          <w:rFonts w:ascii="Times New Roman" w:hAnsi="Times New Roman" w:cs="Times New Roman"/>
-          <w:b/>
-          <w:bCs/>
-          <w:u w:val="single"/>
-        </w:rPr>
-      </w:pPr>
-    </w:p>
-    <w:p>
-      <w:pPr>
-        <w:spacing w:before="80" w:after="100"/>
-        <w:jc w:val="both"/>
-        <w:rPr>
-          <w:rFonts w:ascii="Times New Roman" w:hAnsi="Times New Roman" w:cs="Times New Roman"/>
-          <w:b/>
-          <w:bCs/>
-          <w:u w:val="single"/>
-        </w:rPr>
-      </w:pPr>
-    </w:p>
-    <w:p>
-      <w:pPr>
-        <w:spacing w:before="80" w:after="100"/>
-        <w:jc w:val="both"/>
-        <w:rPr>
-          <w:rFonts w:ascii="Times New Roman" w:hAnsi="Times New Roman" w:cs="Times New Roman"/>
-          <w:b/>
-          <w:bCs/>
-          <w:u w:val="single"/>
-        </w:rPr>
-      </w:pPr>
-    </w:p>
-    <w:p>
-      <w:pPr>
-        <w:spacing w:before="80" w:after="100"/>
-        <w:jc w:val="both"/>
-        <w:rPr>
-          <w:rFonts w:ascii="Times New Roman" w:hAnsi="Times New Roman" w:cs="Times New Roman"/>
-          <w:b/>
-          <w:bCs/>
-          <w:u w:val="single"/>
-        </w:rPr>
-      </w:pPr>
-    </w:p>
-    <w:p>
-      <w:pPr>
-        <w:spacing w:before="80" w:after="100"/>
-        <w:jc w:val="both"/>
-        <w:rPr>
-          <w:rFonts w:ascii="Times New Roman" w:hAnsi="Times New Roman" w:cs="Times New Roman"/>
-          <w:b/>
-          <w:bCs/>
-          <w:u w:val="single"/>
-        </w:rPr>
-      </w:pPr>
       <w:r>
         <w:rPr>
           <w:rFonts w:ascii="Times New Roman" w:hAnsi="Times New Roman" w:cs="Times New Roman"/>
@@ -1547,7 +1774,15 @@
           <w:b/>
           <w:bCs/>
         </w:rPr>
-        <w:t>Discount:</w:t>
+        <w:t>d</w:t>
+      </w:r>
+      <w:r>
+        <w:rPr>
+          <w:rFonts w:ascii="Times New Roman" w:hAnsi="Times New Roman" w:cs="Times New Roman"/>
+          <w:b/>
+          <w:bCs/>
+        </w:rPr>
+        <w:t>iscount:</w:t>
       </w:r>
       <w:r>
         <w:rPr>
@@ -1559,35 +1794,7 @@
         <w:rPr>
           <w:rFonts w:ascii="Times New Roman" w:hAnsi="Times New Roman" w:cs="Times New Roman"/>
         </w:rPr>
-        <w:t xml:space="preserve">as its datatype is </w:t>
-      </w:r>
-      <w:proofErr w:type="gramStart"/>
-      <w:r>
-        <w:rPr>
-          <w:rFonts w:ascii="Times New Roman" w:hAnsi="Times New Roman" w:cs="Times New Roman"/>
-        </w:rPr>
-        <w:t>float</w:t>
-      </w:r>
-      <w:proofErr w:type="gramEnd"/>
-      <w:r>
-        <w:rPr>
-          <w:rFonts w:ascii="Times New Roman" w:hAnsi="Times New Roman" w:cs="Times New Roman"/>
-        </w:rPr>
-        <w:t xml:space="preserve">, it should be filled with numerical values, hence we can use </w:t>
-      </w:r>
-      <w:proofErr w:type="gramStart"/>
-      <w:r>
-        <w:rPr>
-          <w:rFonts w:ascii="Times New Roman" w:hAnsi="Times New Roman" w:cs="Times New Roman"/>
-        </w:rPr>
-        <w:t>median</w:t>
-      </w:r>
-      <w:proofErr w:type="gramEnd"/>
-      <w:r>
-        <w:rPr>
-          <w:rFonts w:ascii="Times New Roman" w:hAnsi="Times New Roman" w:cs="Times New Roman"/>
-        </w:rPr>
-        <w:t xml:space="preserve"> to do so as the column might have outliers due to which mean might give wrong values</w:t>
+        <w:t>as its datatype is float, it should be filled with numerical values, hence we can use median to do so as the column might have outliers due to which mean might give wrong values</w:t>
       </w:r>
     </w:p>
     <w:p>
@@ -2230,54 +2437,6 @@
           <w:u w:val="single"/>
         </w:rPr>
       </w:pPr>
-    </w:p>
-    <w:p>
-      <w:pPr>
-        <w:spacing w:before="60" w:after="60" w:line="240" w:lineRule="auto"/>
-        <w:jc w:val="both"/>
-        <w:rPr>
-          <w:rFonts w:ascii="Times New Roman" w:hAnsi="Times New Roman" w:cs="Times New Roman"/>
-          <w:b/>
-          <w:bCs/>
-          <w:u w:val="single"/>
-        </w:rPr>
-      </w:pPr>
-    </w:p>
-    <w:p>
-      <w:pPr>
-        <w:spacing w:before="60" w:after="60" w:line="240" w:lineRule="auto"/>
-        <w:jc w:val="both"/>
-        <w:rPr>
-          <w:rFonts w:ascii="Times New Roman" w:hAnsi="Times New Roman" w:cs="Times New Roman"/>
-          <w:b/>
-          <w:bCs/>
-          <w:u w:val="single"/>
-        </w:rPr>
-      </w:pPr>
-    </w:p>
-    <w:p>
-      <w:pPr>
-        <w:spacing w:before="60" w:after="60" w:line="240" w:lineRule="auto"/>
-        <w:jc w:val="both"/>
-        <w:rPr>
-          <w:rFonts w:ascii="Times New Roman" w:hAnsi="Times New Roman" w:cs="Times New Roman"/>
-          <w:b/>
-          <w:bCs/>
-          <w:u w:val="single"/>
-        </w:rPr>
-      </w:pPr>
-    </w:p>
-    <w:p>
-      <w:pPr>
-        <w:spacing w:before="60" w:after="60" w:line="240" w:lineRule="auto"/>
-        <w:jc w:val="both"/>
-        <w:rPr>
-          <w:rFonts w:ascii="Times New Roman" w:hAnsi="Times New Roman" w:cs="Times New Roman"/>
-          <w:b/>
-          <w:bCs/>
-          <w:u w:val="single"/>
-        </w:rPr>
-      </w:pPr>
       <w:r>
         <w:rPr>
           <w:rFonts w:ascii="Times New Roman" w:hAnsi="Times New Roman" w:cs="Times New Roman"/>
@@ -2400,6 +2559,7 @@
           <w:szCs w:val="28"/>
           <w:u w:val="single"/>
         </w:rPr>
+        <w:lastRenderedPageBreak/>
         <w:t>Step-5: Removing Duplicates</w:t>
       </w:r>
     </w:p>
@@ -2626,8 +2786,16 @@
       <w:r>
         <w:rPr>
           <w:rFonts w:ascii="Times New Roman" w:hAnsi="Times New Roman" w:cs="Times New Roman"/>
-        </w:rPr>
-        <w:t>d was created.</w:t>
+          <w:b/>
+          <w:bCs/>
+        </w:rPr>
+        <w:t>d</w:t>
+      </w:r>
+      <w:r>
+        <w:rPr>
+          <w:rFonts w:ascii="Times New Roman" w:hAnsi="Times New Roman" w:cs="Times New Roman"/>
+        </w:rPr>
+        <w:t xml:space="preserve"> was created.</w:t>
       </w:r>
     </w:p>
     <w:p>
@@ -2929,6 +3097,7 @@
     <w:p>
       <w:pPr>
         <w:spacing w:before="60" w:after="60" w:line="240" w:lineRule="auto"/>
+        <w:jc w:val="both"/>
         <w:rPr>
           <w:rFonts w:ascii="Times New Roman" w:hAnsi="Times New Roman" w:cs="Times New Roman"/>
         </w:rPr>
@@ -2938,6 +3107,7 @@
       <w:pPr>
         <w:spacing w:before="80" w:after="100"/>
         <w:ind w:left="360"/>
+        <w:jc w:val="both"/>
         <w:rPr>
           <w:rFonts w:ascii="Times New Roman" w:hAnsi="Times New Roman" w:cs="Times New Roman"/>
         </w:rPr>
@@ -2947,6 +3117,7 @@
       <w:pPr>
         <w:spacing w:before="80" w:after="100"/>
         <w:ind w:left="360"/>
+        <w:jc w:val="both"/>
         <w:rPr>
           <w:rFonts w:ascii="Times New Roman" w:hAnsi="Times New Roman" w:cs="Times New Roman"/>
         </w:rPr>
@@ -2955,6 +3126,7 @@
     <w:p>
       <w:pPr>
         <w:spacing w:before="80" w:after="100"/>
+        <w:jc w:val="both"/>
         <w:rPr>
           <w:rFonts w:ascii="Times New Roman" w:hAnsi="Times New Roman" w:cs="Times New Roman"/>
           <w:b/>
@@ -2965,7 +3137,7 @@
     </w:p>
     <w:p>
       <w:pPr>
-        <w:jc w:val="center"/>
+        <w:jc w:val="both"/>
         <w:rPr>
           <w:rFonts w:ascii="Times New Roman" w:hAnsi="Times New Roman" w:cs="Times New Roman"/>
           <w:b/>
@@ -2978,7 +3150,7 @@
     </w:p>
     <w:sectPr>
       <w:pgSz w:w="12240" w:h="15840"/>
-      <w:pgMar w:top="1440" w:right="1440" w:bottom="1440" w:left="1440" w:header="720" w:footer="720" w:gutter="0"/>
+      <w:pgMar w:top="720" w:right="1440" w:bottom="720" w:left="1440" w:header="720" w:footer="720" w:gutter="0"/>
       <w:cols w:space="720"/>
       <w:docGrid w:linePitch="360"/>
     </w:sectPr>
@@ -6890,7 +7062,6 @@
   <w:style w:type="character" w:default="1" w:styleId="DefaultParagraphFont">
     <w:name w:val="Default Paragraph Font"/>
     <w:uiPriority w:val="1"/>
-    <w:semiHidden/>
     <w:unhideWhenUsed/>
   </w:style>
   <w:style w:type="table" w:default="1" w:styleId="TableNormal">

</xml_diff>

<commit_message>
Assignment 1 summary document
</commit_message>
<xml_diff>
--- a/Assignment_1/Celebal_Assignment_1.docx
+++ b/Assignment_1/Celebal_Assignment_1.docx
@@ -87,15 +87,7 @@
           <w:sz w:val="28"/>
           <w:szCs w:val="28"/>
         </w:rPr>
-        <w:t xml:space="preserve"> </w:t>
-      </w:r>
-      <w:r>
-        <w:rPr>
-          <w:rFonts w:ascii="Times New Roman" w:hAnsi="Times New Roman" w:cs="Times New Roman"/>
-          <w:sz w:val="28"/>
-          <w:szCs w:val="28"/>
-        </w:rPr>
-        <w:t>CT_CSI_DE_638</w:t>
+        <w:t xml:space="preserve"> CT_CSI_DE_638</w:t>
       </w:r>
     </w:p>
     <w:p>
@@ -2247,9 +2239,32 @@
           <w:b/>
           <w:bCs/>
         </w:rPr>
-        <w:t>new_</w:t>
-      </w:r>
-      <w:proofErr w:type="gramStart"/>
+        <w:t>new_df</w:t>
+      </w:r>
+      <w:r>
+        <w:rPr>
+          <w:rFonts w:ascii="Times New Roman" w:eastAsia="Arial" w:hAnsi="Times New Roman" w:cs="Times New Roman"/>
+        </w:rPr>
+        <w:t xml:space="preserve"> a</w:t>
+      </w:r>
+      <w:r>
+        <w:rPr>
+          <w:rFonts w:ascii="Times New Roman" w:eastAsia="Arial" w:hAnsi="Times New Roman" w:cs="Times New Roman"/>
+        </w:rPr>
+        <w:t>n</w:t>
+      </w:r>
+      <w:r>
+        <w:rPr>
+          <w:rFonts w:ascii="Times New Roman" w:eastAsia="Arial" w:hAnsi="Times New Roman" w:cs="Times New Roman"/>
+        </w:rPr>
+        <w:t xml:space="preserve">d the older cleaner one </w:t>
+      </w:r>
+      <w:r>
+        <w:rPr>
+          <w:rFonts w:ascii="Times New Roman" w:eastAsia="Arial" w:hAnsi="Times New Roman" w:cs="Times New Roman"/>
+        </w:rPr>
+        <w:t>(</w:t>
+      </w:r>
       <w:r>
         <w:rPr>
           <w:rFonts w:ascii="Times New Roman" w:eastAsia="Arial" w:hAnsi="Times New Roman" w:cs="Times New Roman"/>
@@ -2258,24 +2273,23 @@
         </w:rPr>
         <w:t>df</w:t>
       </w:r>
-      <w:proofErr w:type="gramEnd"/>
-      <w:r>
-        <w:rPr>
-          <w:rFonts w:ascii="Times New Roman" w:eastAsia="Arial" w:hAnsi="Times New Roman" w:cs="Times New Roman"/>
-        </w:rPr>
-        <w:t xml:space="preserve"> a</w:t>
-      </w:r>
-      <w:r>
-        <w:rPr>
-          <w:rFonts w:ascii="Times New Roman" w:eastAsia="Arial" w:hAnsi="Times New Roman" w:cs="Times New Roman"/>
-        </w:rPr>
-        <w:t>n</w:t>
-      </w:r>
-      <w:r>
-        <w:rPr>
-          <w:rFonts w:ascii="Times New Roman" w:eastAsia="Arial" w:hAnsi="Times New Roman" w:cs="Times New Roman"/>
-        </w:rPr>
-        <w:t>d the older cleaner one is kept as it is for future references if we need to use other dropped columns as well.</w:t>
+      <w:r>
+        <w:rPr>
+          <w:rFonts w:ascii="Times New Roman" w:eastAsia="Arial" w:hAnsi="Times New Roman" w:cs="Times New Roman"/>
+        </w:rPr>
+        <w:t xml:space="preserve">) </w:t>
+      </w:r>
+      <w:r>
+        <w:rPr>
+          <w:rFonts w:ascii="Times New Roman" w:eastAsia="Arial" w:hAnsi="Times New Roman" w:cs="Times New Roman"/>
+        </w:rPr>
+        <w:t>is</w:t>
+      </w:r>
+      <w:r>
+        <w:rPr>
+          <w:rFonts w:ascii="Times New Roman" w:eastAsia="Arial" w:hAnsi="Times New Roman" w:cs="Times New Roman"/>
+        </w:rPr>
+        <w:t xml:space="preserve"> kept as it is for future references if we need to use other dropped columns as well.</w:t>
       </w:r>
     </w:p>
     <w:p>
@@ -2582,6 +2596,14 @@
         </w:rPr>
         <w:t xml:space="preserve">First duplicates were checked using: </w:t>
       </w:r>
+      <w:r>
+        <w:rPr>
+          <w:rFonts w:ascii="Times New Roman" w:hAnsi="Times New Roman" w:cs="Times New Roman"/>
+          <w:b/>
+          <w:bCs/>
+        </w:rPr>
+        <w:t>new_</w:t>
+      </w:r>
       <w:proofErr w:type="gramStart"/>
       <w:r>
         <w:rPr>
@@ -2670,6 +2692,14 @@
         </w:rPr>
         <w:t xml:space="preserve"> they could be removed using the function: </w:t>
       </w:r>
+      <w:r>
+        <w:rPr>
+          <w:rFonts w:ascii="Times New Roman" w:eastAsia="Arial" w:hAnsi="Times New Roman" w:cs="Times New Roman"/>
+          <w:b/>
+          <w:bCs/>
+        </w:rPr>
+        <w:t>new_</w:t>
+      </w:r>
       <w:proofErr w:type="gramStart"/>
       <w:r>
         <w:rPr>
@@ -2991,7 +3021,83 @@
         <w:rPr>
           <w:rFonts w:ascii="Times New Roman" w:eastAsia="Arial" w:hAnsi="Times New Roman" w:cs="Times New Roman"/>
         </w:rPr>
+        <w:t>and</w:t>
+      </w:r>
+      <w:r>
+        <w:rPr>
+          <w:rFonts w:ascii="Times New Roman" w:eastAsia="Arial" w:hAnsi="Times New Roman" w:cs="Times New Roman"/>
+          <w:b/>
+          <w:bCs/>
+        </w:rPr>
+        <w:t xml:space="preserve"> </w:t>
+      </w:r>
+      <w:proofErr w:type="gramStart"/>
+      <w:r>
+        <w:rPr>
+          <w:rFonts w:ascii="Times New Roman" w:eastAsia="Arial" w:hAnsi="Times New Roman" w:cs="Times New Roman"/>
+          <w:b/>
+          <w:bCs/>
+        </w:rPr>
+        <w:t>new_df.csv(</w:t>
+      </w:r>
+      <w:proofErr w:type="gramEnd"/>
+      <w:r>
+        <w:rPr>
+          <w:rFonts w:ascii="Times New Roman" w:eastAsia="Arial" w:hAnsi="Times New Roman" w:cs="Times New Roman"/>
+          <w:b/>
+          <w:bCs/>
+        </w:rPr>
+        <w:t xml:space="preserve">) </w:t>
+      </w:r>
+      <w:r>
+        <w:rPr>
+          <w:rFonts w:ascii="Times New Roman" w:eastAsia="Arial" w:hAnsi="Times New Roman" w:cs="Times New Roman"/>
+        </w:rPr>
         <w:t>with index=False.</w:t>
+      </w:r>
+    </w:p>
+    <w:p>
+      <w:pPr>
+        <w:pStyle w:val="ListParagraph"/>
+        <w:numPr>
+          <w:ilvl w:val="0"/>
+          <w:numId w:val="29"/>
+        </w:numPr>
+        <w:spacing w:before="80" w:after="100"/>
+        <w:jc w:val="both"/>
+        <w:rPr>
+          <w:rFonts w:ascii="Times New Roman" w:hAnsi="Times New Roman" w:cs="Times New Roman"/>
+        </w:rPr>
+      </w:pPr>
+      <w:r>
+        <w:rPr>
+          <w:rFonts w:ascii="Times New Roman" w:eastAsia="Arial" w:hAnsi="Times New Roman" w:cs="Times New Roman"/>
+        </w:rPr>
+        <w:t xml:space="preserve">Two CSV files were saved to preserve both versions of the dataset — the full cleaned version (all 24 columns) for future </w:t>
+      </w:r>
+      <w:r>
+        <w:rPr>
+          <w:rFonts w:ascii="Times New Roman" w:eastAsia="Arial" w:hAnsi="Times New Roman" w:cs="Times New Roman"/>
+        </w:rPr>
+        <w:t>use/references</w:t>
+      </w:r>
+      <w:r>
+        <w:rPr>
+          <w:rFonts w:ascii="Times New Roman" w:eastAsia="Arial" w:hAnsi="Times New Roman" w:cs="Times New Roman"/>
+        </w:rPr>
+        <w:t>, and the reduced version (12 columns) used for the current analysis</w:t>
+      </w:r>
+      <w:r>
+        <w:rPr>
+          <w:rFonts w:ascii="Times New Roman" w:eastAsia="Arial" w:hAnsi="Times New Roman" w:cs="Times New Roman"/>
+        </w:rPr>
+        <w:t xml:space="preserve">, </w:t>
+      </w:r>
+      <w:r>
+        <w:rPr>
+          <w:rFonts w:ascii="Times New Roman" w:eastAsia="Arial" w:hAnsi="Times New Roman" w:cs="Times New Roman"/>
+        </w:rPr>
+        <w:t>so that the original data is not lost.</w:t>
       </w:r>
     </w:p>
     <w:p>
@@ -7062,6 +7168,7 @@
   <w:style w:type="character" w:default="1" w:styleId="DefaultParagraphFont">
     <w:name w:val="Default Paragraph Font"/>
     <w:uiPriority w:val="1"/>
+    <w:semiHidden/>
     <w:unhideWhenUsed/>
   </w:style>
   <w:style w:type="table" w:default="1" w:styleId="TableNormal">

</xml_diff>